<commit_message>
feat: Factum comercial sin marca MPF/GFD, logo Sello y emisor configurable (marca-comercial-sin-mpf-gfd)
- logo "Sello" generado de forma reproducible (ops/brand/) para client/, agent-ui/ y el pie del informe
- Branding configurable (nombre, logo, líneas de contacto) vía appsettings.Local.json, fuera de git
- GET /api/config/public y GET /api/config/branding/logo
- plantilla v3 sin imágenes institucionales + "Realizado con Factum" en el pie
- textos y assets MPF/GFD/Evidentia eliminados; AGENTS.md y README actualizados
- arnés: HU, SDD, progress de implementación y review (APROBADA)

Co-Authored-By: Claude Opus 5.5 <noreply@anthropic.com>
</commit_message>
<xml_diff>
--- a/server/src/Factum.Backend/Templates/plantilla_informe_v3.docx
+++ b/server/src/Factum.Backend/Templates/plantilla_informe_v3.docx
@@ -8,170 +8,6 @@
           <w:rFonts w:ascii="Arial" w:hAnsi="Arial" w:cs="Arial"/>
         </w:rPr>
       </w:pPr>
-      <w:r>
-        <w:rPr>
-          <w:rFonts w:ascii="Arial" w:hAnsi="Arial" w:cs="Arial"/>
-        </w:rPr>
-        <w:drawing>
-          <wp:anchor distT="0" distB="0" distL="114300" distR="114300" simplePos="0" relativeHeight="251663360" behindDoc="0" locked="0" layoutInCell="1" allowOverlap="1">
-            <wp:simplePos x="0" y="0"/>
-            <wp:positionH relativeFrom="page">
-              <wp:posOffset>4691380</wp:posOffset>
-            </wp:positionH>
-            <wp:positionV relativeFrom="page">
-              <wp:posOffset>516890</wp:posOffset>
-            </wp:positionV>
-            <wp:extent cx="385445" cy="385445"/>
-            <wp:effectExtent l="0" t="0" r="0" b="0"/>
-            <wp:wrapNone/>
-            <wp:docPr id="536974657" name="Imagen 9"/>
-            <wp:cNvGraphicFramePr>
-              <a:graphicFrameLocks xmlns:a="http://schemas.openxmlformats.org/drawingml/2006/main" noChangeAspect="1"/>
-            </wp:cNvGraphicFramePr>
-            <a:graphic xmlns:a="http://schemas.openxmlformats.org/drawingml/2006/main">
-              <a:graphicData uri="http://schemas.openxmlformats.org/drawingml/2006/picture">
-                <pic:pic xmlns:pic="http://schemas.openxmlformats.org/drawingml/2006/picture">
-                  <pic:nvPicPr>
-                    <pic:cNvPr id="536974657" name="Imagen 9"/>
-                    <pic:cNvPicPr>
-                      <a:picLocks noChangeAspect="1"/>
-                    </pic:cNvPicPr>
-                  </pic:nvPicPr>
-                  <pic:blipFill>
-                    <a:blip r:embed="rId6" cstate="print">
-                      <a:extLst>
-                        <a:ext uri="{28A0092B-C50C-407E-A947-70E740481C1C}">
-                          <a14:useLocalDpi xmlns:a14="http://schemas.microsoft.com/office/drawing/2010/main" val="0"/>
-                        </a:ext>
-                      </a:extLst>
-                    </a:blip>
-                    <a:stretch>
-                      <a:fillRect/>
-                    </a:stretch>
-                  </pic:blipFill>
-                  <pic:spPr>
-                    <a:xfrm>
-                      <a:off x="0" y="0"/>
-                      <a:ext cx="385417" cy="385417"/>
-                    </a:xfrm>
-                    <a:prstGeom prst="rect">
-                      <a:avLst/>
-                    </a:prstGeom>
-                  </pic:spPr>
-                </pic:pic>
-              </a:graphicData>
-            </a:graphic>
-          </wp:anchor>
-        </w:drawing>
-      </w:r>
-      <w:r>
-        <w:rPr>
-          <w:rFonts w:ascii="Arial" w:hAnsi="Arial" w:cs="Arial"/>
-          <w:sz w:val="48"/>
-          <w:szCs w:val="48"/>
-        </w:rPr>
-        <w:drawing>
-          <wp:anchor distT="0" distB="0" distL="114300" distR="114300" simplePos="0" relativeHeight="251661312" behindDoc="0" locked="0" layoutInCell="1" allowOverlap="1">
-            <wp:simplePos x="0" y="0"/>
-            <wp:positionH relativeFrom="page">
-              <wp:posOffset>1915795</wp:posOffset>
-            </wp:positionH>
-            <wp:positionV relativeFrom="page">
-              <wp:posOffset>514985</wp:posOffset>
-            </wp:positionV>
-            <wp:extent cx="347345" cy="347345"/>
-            <wp:effectExtent l="0" t="0" r="0" b="0"/>
-            <wp:wrapNone/>
-            <wp:docPr id="1692865576" name="Imagen 3"/>
-            <wp:cNvGraphicFramePr>
-              <a:graphicFrameLocks xmlns:a="http://schemas.openxmlformats.org/drawingml/2006/main" noChangeAspect="1"/>
-            </wp:cNvGraphicFramePr>
-            <a:graphic xmlns:a="http://schemas.openxmlformats.org/drawingml/2006/main">
-              <a:graphicData uri="http://schemas.openxmlformats.org/drawingml/2006/picture">
-                <pic:pic xmlns:pic="http://schemas.openxmlformats.org/drawingml/2006/picture">
-                  <pic:nvPicPr>
-                    <pic:cNvPr id="1692865576" name="Imagen 3"/>
-                    <pic:cNvPicPr>
-                      <a:picLocks noChangeAspect="1"/>
-                    </pic:cNvPicPr>
-                  </pic:nvPicPr>
-                  <pic:blipFill>
-                    <a:blip r:embed="rId7" cstate="print">
-                      <a:extLst>
-                        <a:ext uri="{28A0092B-C50C-407E-A947-70E740481C1C}">
-                          <a14:useLocalDpi xmlns:a14="http://schemas.microsoft.com/office/drawing/2010/main" val="0"/>
-                        </a:ext>
-                      </a:extLst>
-                    </a:blip>
-                    <a:stretch>
-                      <a:fillRect/>
-                    </a:stretch>
-                  </pic:blipFill>
-                  <pic:spPr>
-                    <a:xfrm>
-                      <a:off x="0" y="0"/>
-                      <a:ext cx="347218" cy="347218"/>
-                    </a:xfrm>
-                    <a:prstGeom prst="rect">
-                      <a:avLst/>
-                    </a:prstGeom>
-                  </pic:spPr>
-                </pic:pic>
-              </a:graphicData>
-            </a:graphic>
-          </wp:anchor>
-        </w:drawing>
-      </w:r>
-      <w:r>
-        <w:rPr>
-          <w:rFonts w:ascii="Arial" w:hAnsi="Arial" w:cs="Arial"/>
-        </w:rPr>
-        <w:drawing>
-          <wp:anchor distT="0" distB="0" distL="114300" distR="114300" simplePos="0" relativeHeight="251662336" behindDoc="0" locked="0" layoutInCell="1" allowOverlap="1">
-            <wp:simplePos x="0" y="0"/>
-            <wp:positionH relativeFrom="page">
-              <wp:posOffset>248920</wp:posOffset>
-            </wp:positionH>
-            <wp:positionV relativeFrom="page">
-              <wp:posOffset>600710</wp:posOffset>
-            </wp:positionV>
-            <wp:extent cx="328295" cy="328295"/>
-            <wp:effectExtent l="0" t="0" r="2540" b="2540"/>
-            <wp:wrapNone/>
-            <wp:docPr id="1056009662" name="Gráfico 5"/>
-            <wp:cNvGraphicFramePr>
-              <a:graphicFrameLocks xmlns:a="http://schemas.openxmlformats.org/drawingml/2006/main" noChangeAspect="1"/>
-            </wp:cNvGraphicFramePr>
-            <a:graphic xmlns:a="http://schemas.openxmlformats.org/drawingml/2006/main">
-              <a:graphicData uri="http://schemas.openxmlformats.org/drawingml/2006/picture">
-                <pic:pic xmlns:pic="http://schemas.openxmlformats.org/drawingml/2006/picture">
-                  <pic:nvPicPr>
-                    <pic:cNvPr id="1056009662" name="Gráfico 5"/>
-                    <pic:cNvPicPr>
-                      <a:picLocks noChangeAspect="1"/>
-                    </pic:cNvPicPr>
-                  </pic:nvPicPr>
-                  <pic:blipFill>
-                    <a:blip r:embed="rId8"/>
-                    <a:stretch>
-                      <a:fillRect/>
-                    </a:stretch>
-                  </pic:blipFill>
-                  <pic:spPr>
-                    <a:xfrm>
-                      <a:off x="0" y="0"/>
-                      <a:ext cx="328168" cy="328168"/>
-                    </a:xfrm>
-                    <a:prstGeom prst="rect">
-                      <a:avLst/>
-                    </a:prstGeom>
-                  </pic:spPr>
-                </pic:pic>
-              </a:graphicData>
-            </a:graphic>
-          </wp:anchor>
-        </w:drawing>
-      </w:r>
       <w:r>
         <w:rPr>
           <w:rFonts w:ascii="Arial" w:hAnsi="Arial" w:cs="Arial"/>
@@ -263,7 +99,7 @@
                                 <w:rFonts w:ascii="Arial" w:hAnsi="Arial" w:cs="Arial"/>
                                 <w:color w:val="D9D9D9" w:themeColor="background1" w:themeShade="D9"/>
                               </w:rPr>
-                              <w:t xml:space="preserve">            Evidentia – Web  |             Gabinete Forense Digital – CIF    |          Ministerio Publico Fiscal</w:t>
+                              <w:t>{ORGANIZACION}</w:t>
                             </w:r>
                           </w:p>
                         </w:txbxContent>
@@ -320,7 +156,7 @@
                           <w:rFonts w:ascii="Arial" w:hAnsi="Arial" w:cs="Arial"/>
                           <w:color w:val="D9D9D9" w:themeColor="background1" w:themeShade="D9"/>
                         </w:rPr>
-                        <w:t xml:space="preserve">            Evidentia – Web  |             Gabinete Forense Digital – CIF    |          Ministerio Publico Fiscal</w:t>
+                        <w:t>{ORGANIZACION}</w:t>
                       </w:r>
                     </w:p>
                   </w:txbxContent>

</xml_diff>